<commit_message>
Adopt new title: Quantum Electrostatic Scanning Probe Microscopy: Spatial Information Limits, Identifiability, and Metrological Uncertainty
</commit_message>
<xml_diff>
--- a/submission_measurement/title_page.docx
+++ b/submission_measurement/title_page.docx
@@ -2,13 +2,13 @@
 <file path=word/document.xml><?xml version="1.0" encoding="utf-8"?>
 <w:document xmlns:w="http://schemas.openxmlformats.org/wordprocessingml/2006/main" xmlns:m="http://schemas.openxmlformats.org/officeDocument/2006/math" xmlns:r="http://schemas.openxmlformats.org/officeDocument/2006/relationships" xmlns:o="urn:schemas-microsoft-com:office:office" xmlns:v="urn:schemas-microsoft-com:vml" xmlns:w10="urn:schemas-microsoft-com:office:word" xmlns:a="http://schemas.openxmlformats.org/drawingml/2006/main" xmlns:pic="http://schemas.openxmlformats.org/drawingml/2006/picture" xmlns:wp="http://schemas.openxmlformats.org/drawingml/2006/wordprocessingDrawing">
   <w:body>
-    <w:bookmarkStart w:id="23" w:name="Xb935267181d54317491dd2fcd85c3c34091f7c6"/>
+    <w:bookmarkStart w:id="23" w:name="Xdbf2ecc56f08b1f873f06ddb8afc481be056e3d"/>
     <w:p>
       <w:pPr>
         <w:pStyle w:val="Heading1"/>
       </w:pPr>
       <w:r>
-        <w:t xml:space="preserve">Quantum Limits of Surface Metrology: Spatial Information Extraction by a Single Trapped Ion</w:t>
+        <w:t xml:space="preserve">Quantum Electrostatic Scanning Probe Microscopy: Spatial Information Limits, Identifiability, and Metrological Uncertainty</w:t>
       </w:r>
     </w:p>
     <w:p>

</xml_diff>